<commit_message>
Add an author and department byline to the three documents
Each of the three SharePoint documents now carries a byline under its
title — author, department and date — and the same values in the Word
document properties (creator, last modified by, title, subject,
keywords, description), which is what SharePoint reads for its Author
and Subject columns.

Author and department are placeholders, `[Your Name]` and
`[Department]`, in the byline and in the properties alike. Both need
replacing before publishing, alongside the host name that was already
a placeholder; HANDOFF.md says so on each document's row.

Co-Authored-By: Claude Opus 5 <noreply@anthropic.com>
Claude-Session: https://claude.ai/code/session_01PHFNgNQq4kHC92ud6AjHdg
</commit_message>
<xml_diff>
--- a/Application-List-Operator-Reference.docx
+++ b/Application-List-Operator-Reference.docx
@@ -35,7 +35,7 @@
     </w:p>
     <w:p>
       <w:pPr>
-        <w:spacing w:after="60" w:line="276"/>
+        <w:spacing w:after="90" w:line="276"/>
       </w:pPr>
       <w:r>
         <w:rPr>
@@ -44,6 +44,55 @@
           <w:szCs w:val="22"/>
         </w:rPr>
         <w:t xml:space="preserve">Routes, parameters and the commands for running it. For whoever maintains the tool — technicians need the separate one-page guide, not this.</w:t>
+      </w:r>
+    </w:p>
+    <w:p>
+      <w:pPr>
+        <w:spacing w:after="60" w:line="276"/>
+      </w:pPr>
+      <w:r>
+        <w:rPr>
+          <w:color w:val="5A6472"/>
+          <w:sz w:val="20"/>
+          <w:szCs w:val="20"/>
+        </w:rPr>
+        <w:t xml:space="preserve">Author </w:t>
+      </w:r>
+      <w:r>
+        <w:rPr>
+          <w:b/>
+          <w:bCs/>
+          <w:color w:val="5A6472"/>
+          <w:sz w:val="20"/>
+          <w:szCs w:val="20"/>
+        </w:rPr>
+        <w:t xml:space="preserve">[Your Name]</w:t>
+      </w:r>
+      <w:r>
+        <w:rPr>
+          <w:color w:val="5A6472"/>
+          <w:sz w:val="20"/>
+          <w:szCs w:val="20"/>
+        </w:rPr>
+        <w:t xml:space="preserve">  ·  Department </w:t>
+      </w:r>
+      <w:r>
+        <w:rPr>
+          <w:b/>
+          <w:bCs/>
+          <w:color w:val="5A6472"/>
+          <w:sz w:val="20"/>
+          <w:szCs w:val="20"/>
+        </w:rPr>
+        <w:t xml:space="preserve">[Department]</w:t>
+      </w:r>
+      <w:r>
+        <w:rPr>
+          <w:color w:val="5A6472"/>
+          <w:sz w:val="20"/>
+          <w:szCs w:val="20"/>
+        </w:rPr>
+        <w:t xml:space="preserve">  ·  September 2026</w:t>
       </w:r>
     </w:p>
     <w:p>

</xml_diff>

<commit_message>
Revert "Add an author and department byline to the three documents"
This reverts commit 381b7bd71c6d87442709c3ee3f88f9adda38aeab.
</commit_message>
<xml_diff>
--- a/Application-List-Operator-Reference.docx
+++ b/Application-List-Operator-Reference.docx
@@ -35,7 +35,7 @@
     </w:p>
     <w:p>
       <w:pPr>
-        <w:spacing w:after="90" w:line="276"/>
+        <w:spacing w:after="60" w:line="276"/>
       </w:pPr>
       <w:r>
         <w:rPr>
@@ -44,55 +44,6 @@
           <w:szCs w:val="22"/>
         </w:rPr>
         <w:t xml:space="preserve">Routes, parameters and the commands for running it. For whoever maintains the tool — technicians need the separate one-page guide, not this.</w:t>
-      </w:r>
-    </w:p>
-    <w:p>
-      <w:pPr>
-        <w:spacing w:after="60" w:line="276"/>
-      </w:pPr>
-      <w:r>
-        <w:rPr>
-          <w:color w:val="5A6472"/>
-          <w:sz w:val="20"/>
-          <w:szCs w:val="20"/>
-        </w:rPr>
-        <w:t xml:space="preserve">Author </w:t>
-      </w:r>
-      <w:r>
-        <w:rPr>
-          <w:b/>
-          <w:bCs/>
-          <w:color w:val="5A6472"/>
-          <w:sz w:val="20"/>
-          <w:szCs w:val="20"/>
-        </w:rPr>
-        <w:t xml:space="preserve">[Your Name]</w:t>
-      </w:r>
-      <w:r>
-        <w:rPr>
-          <w:color w:val="5A6472"/>
-          <w:sz w:val="20"/>
-          <w:szCs w:val="20"/>
-        </w:rPr>
-        <w:t xml:space="preserve">  ·  Department </w:t>
-      </w:r>
-      <w:r>
-        <w:rPr>
-          <w:b/>
-          <w:bCs/>
-          <w:color w:val="5A6472"/>
-          <w:sz w:val="20"/>
-          <w:szCs w:val="20"/>
-        </w:rPr>
-        <w:t xml:space="preserve">[Department]</w:t>
-      </w:r>
-      <w:r>
-        <w:rPr>
-          <w:color w:val="5A6472"/>
-          <w:sz w:val="20"/>
-          <w:szCs w:val="20"/>
-        </w:rPr>
-        <w:t xml:space="preserve">  ·  September 2026</w:t>
       </w:r>
     </w:p>
     <w:p>

</xml_diff>